<commit_message>
docs: update unit 5 deliverable with SonarCloud result and evidence
Co-Authored-By: Claude Sonnet 5.5 <noreply@anthropic.com>
</commit_message>
<xml_diff>
--- a/unidad5v2/TP Unidad 5 - Hakanson Morales.docx
+++ b/unidad5v2/TP Unidad 5 - Hakanson Morales.docx
@@ -2265,7 +2265,52 @@
           <w:b w:val="0"/>
           <w:sz w:val="21"/>
         </w:rPr>
-        <w:t>Se agregó sonar-project.properties (fuentes, pruebas y reporte de cobertura lcov) y el workflow .github/workflows/sonarcloud.yml, que corre las pruebas con cobertura y envía el análisis a SonarCloud en cada push y Pull Request a main. Estado: la configuración está en el repositorio; para activar el escaneo falta vincular el repositorio en sonarcloud.io y cargar el secreto SONAR_TOKEN en GitHub (sin el secreto el paso se omite).</w:t>
+        <w:t>Se agregó sonar-project.properties (fuentes, pruebas y reporte de cobertura lcov) y el workflow .github/workflows/sonarcloud.yml, que corre las pruebas con cobertura y envía el análisis a SonarCloud en cada push y Pull Request a main. El repositorio quedó vinculado en SonarCloud con el secreto SONAR_TOKEN. Resultado en el Pull Request #4 (rama_nueva hacia main): Quality Gate aprobado, 0 issues nuevos, 0 Security Hotspots, 0,0 % de duplicación y 4 checks de GitHub en verde; además, Render desplegó la API y el sitio web de la rama. La cobertura de 0,0 % sobre código nuevo se debe a que el PR contiene documentación y no código de la aplicación; la cobertura real de la API (84,61 % de líneas) se mide con Vitest. SonarCloud informó también 11 riesgos de dependencias (vulnerabilidades conocidas en paquetes de npm), que no bloquean el Quality Gate y quedan para revisar.</w:t>
+      </w:r>
+    </w:p>
+    <w:p>
+      <w:r>
+        <w:drawing>
+          <wp:inline>
+            <wp:extent cx="4680000" cy="4507033"/>
+            <wp:docPr id="1" name="Picture 1"/>
+            <wp:cNvGraphicFramePr>
+              <a:graphicFrameLocks noChangeAspect="1"/>
+            </wp:cNvGraphicFramePr>
+            <a:graphic>
+              <a:graphicData uri="http://schemas.openxmlformats.org/drawingml/2006/picture">
+                <pic:pic>
+                  <pic:nvPicPr>
+                    <pic:cNvPr id="0" name="evidencia-sonarcloud-pr4.png"/>
+                    <pic:cNvPicPr/>
+                  </pic:nvPicPr>
+                  <pic:blipFill>
+                    <a:blip r:embed="rId7"/>
+                    <a:stretch>
+                      <a:fillRect/>
+                    </a:stretch>
+                  </pic:blipFill>
+                  <pic:spPr>
+                    <a:xfrm>
+                      <a:off x="0" y="0"/>
+                      <a:ext cx="4680000" cy="4507033"/>
+                    </a:xfrm>
+                    <a:prstGeom prst="rect"/>
+                  </pic:spPr>
+                </pic:pic>
+              </a:graphicData>
+            </a:graphic>
+          </wp:inline>
+        </w:drawing>
+      </w:r>
+    </w:p>
+    <w:p>
+      <w:r>
+        <w:rPr>
+          <w:i/>
+          <w:sz w:val="18"/>
+        </w:rPr>
+        <w:t>Figura: Pull Request #4 con el Quality Gate de SonarCloud aprobado y los checks en verde.</w:t>
       </w:r>
     </w:p>
     <w:p>

</xml_diff>

<commit_message>
docs: mark main branch protection as enabled in unit 5 deliverable
Co-Authored-By: Claude Sonnet 5.5 <noreply@anthropic.com>
</commit_message>
<xml_diff>
--- a/unidad5v2/TP Unidad 5 - Hakanson Morales.docx
+++ b/unidad5v2/TP Unidad 5 - Hakanson Morales.docx
@@ -2241,7 +2241,7 @@
           <w:b w:val="0"/>
           <w:sz w:val="21"/>
         </w:rPr>
-        <w:t>• Detalle completo en docs/POLITICA_PR.md. Las reglas de protección de rama se activan desde Settings &gt; Branches del repositorio en GitHub.</w:t>
+        <w:t>• Detalle completo en docs/POLITICA_PR.md. Las reglas de protección de rama están activadas en Settings &gt; Branches del repositorio en GitHub.</w:t>
       </w:r>
     </w:p>
     <w:p>
@@ -3502,7 +3502,7 @@
           <w:b w:val="0"/>
           <w:sz w:val="21"/>
         </w:rPr>
-        <w:t>• Repositorio: github.com/kahnaisehC/educar-para-transformar (rama rama_nueva; la protección de main por Pull Request se activa en Settings &gt; Branches).</w:t>
+        <w:t>• Repositorio: github.com/kahnaisehC/educar-para-transformar (rama rama_nueva; la rama main está protegida: solo se modifica mediante Pull Request, con aprobación y checks obligatorios).</w:t>
       </w:r>
     </w:p>
     <w:p>

</xml_diff>